<commit_message>
J'ai rajouter des trucs
</commit_message>
<xml_diff>
--- a/Analyse/stbl/StblVersion1WIP.docx
+++ b/Analyse/stbl/StblVersion1WIP.docx
@@ -272,24 +272,11 @@
             <w:r>
               <w:t xml:space="preserve">Les </w:t>
             </w:r>
-            <w:proofErr w:type="gramStart"/>
-            <w:r>
-              <w:t xml:space="preserve">règles </w:t>
-            </w:r>
-            <w:r>
-              <w:t>,</w:t>
-            </w:r>
-            <w:proofErr w:type="gramEnd"/>
-            <w:r>
-              <w:t xml:space="preserve"> </w:t>
-            </w:r>
-            <w:proofErr w:type="gramStart"/>
-            <w:r>
-              <w:t>système ,</w:t>
-            </w:r>
-            <w:proofErr w:type="gramEnd"/>
-            <w:r>
-              <w:t xml:space="preserve"> objectif, possibilité </w:t>
+            <w:r>
+              <w:t>règles,</w:t>
+            </w:r>
+            <w:r>
+              <w:t xml:space="preserve"> système, objectif, possibilité </w:t>
             </w:r>
             <w:r>
               <w:t>et manière de jouer d’un jeu</w:t>
@@ -378,6 +365,131 @@
           </w:p>
         </w:tc>
       </w:tr>
+      <w:tr>
+        <w:tc>
+          <w:tcPr>
+            <w:tcW w:w="4531" w:type="dxa"/>
+          </w:tcPr>
+          <w:p>
+            <w:proofErr w:type="spellStart"/>
+            <w:r>
+              <w:t>Pnj</w:t>
+            </w:r>
+            <w:proofErr w:type="spellEnd"/>
+          </w:p>
+        </w:tc>
+        <w:tc>
+          <w:tcPr>
+            <w:tcW w:w="4531" w:type="dxa"/>
+          </w:tcPr>
+          <w:p>
+            <w:r>
+              <w:t>Personnage non joueur</w:t>
+            </w:r>
+          </w:p>
+        </w:tc>
+      </w:tr>
+      <w:tr>
+        <w:tc>
+          <w:tcPr>
+            <w:tcW w:w="4531" w:type="dxa"/>
+          </w:tcPr>
+          <w:p>
+            <w:proofErr w:type="spellStart"/>
+            <w:r>
+              <w:t>Fps</w:t>
+            </w:r>
+            <w:proofErr w:type="spellEnd"/>
+            <w:r>
+              <w:t xml:space="preserve"> (Frame per seconds)</w:t>
+            </w:r>
+          </w:p>
+        </w:tc>
+        <w:tc>
+          <w:tcPr>
+            <w:tcW w:w="4531" w:type="dxa"/>
+          </w:tcPr>
+          <w:p>
+            <w:r>
+              <w:t>Nombre d’image par seconds</w:t>
+            </w:r>
+          </w:p>
+        </w:tc>
+      </w:tr>
+      <w:tr>
+        <w:tc>
+          <w:tcPr>
+            <w:tcW w:w="4531" w:type="dxa"/>
+          </w:tcPr>
+          <w:p>
+            <w:r>
+              <w:lastRenderedPageBreak/>
+              <w:t>Soft-Lock</w:t>
+            </w:r>
+          </w:p>
+        </w:tc>
+        <w:tc>
+          <w:tcPr>
+            <w:tcW w:w="4531" w:type="dxa"/>
+          </w:tcPr>
+          <w:p>
+            <w:r>
+              <w:t xml:space="preserve">Quand un problème de </w:t>
+            </w:r>
+            <w:proofErr w:type="spellStart"/>
+            <w:r>
+              <w:t>game</w:t>
+            </w:r>
+            <w:proofErr w:type="spellEnd"/>
+            <w:r>
+              <w:t>/</w:t>
+            </w:r>
+            <w:proofErr w:type="spellStart"/>
+            <w:r>
+              <w:t>level</w:t>
+            </w:r>
+            <w:proofErr w:type="spellEnd"/>
+            <w:r>
+              <w:t xml:space="preserve"> design </w:t>
+            </w:r>
+            <w:proofErr w:type="spellStart"/>
+            <w:r>
+              <w:t>empeche</w:t>
+            </w:r>
+            <w:proofErr w:type="spellEnd"/>
+            <w:r>
+              <w:t xml:space="preserve"> le joueur de progresser dans le jeu</w:t>
+            </w:r>
+          </w:p>
+        </w:tc>
+      </w:tr>
+      <w:tr>
+        <w:tc>
+          <w:tcPr>
+            <w:tcW w:w="4531" w:type="dxa"/>
+          </w:tcPr>
+          <w:p>
+            <w:r>
+              <w:t xml:space="preserve">RAM </w:t>
+            </w:r>
+          </w:p>
+        </w:tc>
+        <w:tc>
+          <w:tcPr>
+            <w:tcW w:w="4531" w:type="dxa"/>
+          </w:tcPr>
+          <w:p>
+            <w:proofErr w:type="gramStart"/>
+            <w:r>
+              <w:t>Composant  d’un</w:t>
+            </w:r>
+            <w:proofErr w:type="gramEnd"/>
+            <w:r>
+              <w:t xml:space="preserve"> ordinateur le dotant de mémoire vive</w:t>
+            </w:r>
+          </w:p>
+        </w:tc>
+      </w:tr>
     </w:tbl>
     <w:p/>
     <w:p>
@@ -387,62 +499,6 @@
           <w:bCs/>
         </w:rPr>
       </w:pPr>
-    </w:p>
-    <w:p>
-      <w:pPr>
-        <w:rPr>
-          <w:b/>
-          <w:bCs/>
-        </w:rPr>
-      </w:pPr>
-    </w:p>
-    <w:p>
-      <w:pPr>
-        <w:rPr>
-          <w:b/>
-          <w:bCs/>
-        </w:rPr>
-      </w:pPr>
-    </w:p>
-    <w:p>
-      <w:pPr>
-        <w:rPr>
-          <w:b/>
-          <w:bCs/>
-        </w:rPr>
-      </w:pPr>
-    </w:p>
-    <w:p>
-      <w:pPr>
-        <w:rPr>
-          <w:b/>
-          <w:bCs/>
-        </w:rPr>
-      </w:pPr>
-    </w:p>
-    <w:p>
-      <w:pPr>
-        <w:rPr>
-          <w:b/>
-          <w:bCs/>
-        </w:rPr>
-      </w:pPr>
-    </w:p>
-    <w:p>
-      <w:pPr>
-        <w:rPr>
-          <w:b/>
-          <w:bCs/>
-        </w:rPr>
-      </w:pPr>
-    </w:p>
-    <w:p>
-      <w:pPr>
-        <w:rPr>
-          <w:b/>
-          <w:bCs/>
-        </w:rPr>
-      </w:pPr>
       <w:r>
         <w:rPr>
           <w:b/>
@@ -615,34 +671,587 @@
     <w:p/>
     <w:p>
       <w:r>
+        <w:t xml:space="preserve">- Crée un jeu avec un code et des </w:t>
+      </w:r>
+      <w:r>
+        <w:t>assets optimiser</w:t>
+      </w:r>
+      <w:r>
+        <w:t xml:space="preserve"> afin d’avoir un jeu léger</w:t>
+      </w:r>
+      <w:r>
+        <w:t>, fluide et économe en ressource, le code et les assets seront conçue avec le but qu’ils soient le plus léger possible et qu’ils consomment le moins de mémoire possible. Aucune garantie que le code et les assets soient le plus légers et optimiser possible.</w:t>
+      </w:r>
+      <w:r>
+        <w:t xml:space="preserve"> (NEED CONDITION)</w:t>
+      </w:r>
+    </w:p>
+    <w:p>
+      <w:r>
         <w:lastRenderedPageBreak/>
-        <w:t xml:space="preserve">- Crée un jeu avec un code et des </w:t>
-      </w:r>
-      <w:r>
-        <w:t>assets optimiser</w:t>
-      </w:r>
-      <w:r>
-        <w:t xml:space="preserve"> afin d’avoir un jeu léger</w:t>
-      </w:r>
-      <w:r>
-        <w:t>, fluide et économe en ressource, le code et les assets seront conçue avec le but qu’ils soient le plus léger possible et qu’ils consomment le moins de mémoire possible. Aucune garantie que le code et les assets soient le plus légers et optimiser possible.</w:t>
-      </w:r>
-      <w:r>
+        <w:t xml:space="preserve">         - Crée un tutoriel qui permettra aux joueurs d’appréhendé les contrôles et le gameplay du jeu, ce/ces tutoriels devront expliquer toutes les mécanique et concept du jeu. Aucune garantie que le/les tutoriels couvrent l’entièreté des utilisations possible ou donne les solutions aux énigmes.</w:t>
+      </w:r>
+    </w:p>
+    <w:p>
+      <w:r>
+        <w:t xml:space="preserve">         - Le devra être sauvegarder au moins entre chaque niveau garantissant aux joueurs la possibilité de charger une sauvegarde et de ne pas perdre leurs progressions</w:t>
+      </w:r>
+    </w:p>
+    <w:p>
+      <w:r>
+        <w:t xml:space="preserve">         -Le jeu sera jouable par n’importe qui peut-importe qui sait lire le français, aucune autre éducations, apprentissage ou expérience sera nécessaire pour jouer à ce jeu.</w:t>
+      </w:r>
+    </w:p>
+    <w:p>
+      <w:r>
+        <w:t xml:space="preserve">         -le joueur devra avoir la possibilité de se déplacer, de ramasser des indices et de les combiner, de parler à des </w:t>
+      </w:r>
+      <w:proofErr w:type="spellStart"/>
+      <w:r>
+        <w:t>pnjs</w:t>
+      </w:r>
+      <w:proofErr w:type="spellEnd"/>
+      <w:r>
+        <w:t xml:space="preserve">, de résoudre des énigmes, de visiter différents niveaux, et d’autre fonctionnalité non encore défini. Le jeu devra être capable de tourner en 60 </w:t>
+      </w:r>
+      <w:proofErr w:type="spellStart"/>
+      <w:r>
+        <w:t>fps</w:t>
+      </w:r>
+      <w:proofErr w:type="spellEnd"/>
+      <w:r>
+        <w:t xml:space="preserve"> constamment sur un pc disposant de Windows 11 et ayant une </w:t>
+      </w:r>
+      <w:r>
+        <w:t>configuration moyen</w:t>
+      </w:r>
+      <w:r>
+        <w:t xml:space="preserve"> gamme.</w:t>
+      </w:r>
+    </w:p>
+    <w:p/>
+    <w:p>
+      <w:pPr>
+        <w:rPr>
+          <w:b/>
+          <w:bCs/>
+        </w:rPr>
+      </w:pPr>
+      <w:r>
+        <w:rPr>
+          <w:b/>
+          <w:bCs/>
+        </w:rPr>
+        <w:t>4.2 Exigences concernant la conception et la réalisation</w:t>
+      </w:r>
+    </w:p>
+    <w:p>
+      <w:pPr>
+        <w:rPr>
+          <w:b/>
+          <w:bCs/>
+        </w:rPr>
+      </w:pPr>
+      <w:r>
+        <w:rPr>
+          <w:b/>
+          <w:bCs/>
+        </w:rPr>
+        <w:t>4.2.1 Exigences envers les facteurs de qualité</w:t>
+      </w:r>
+    </w:p>
+    <w:p>
+      <w:r>
+        <w:rPr>
+          <w:b/>
+          <w:bCs/>
+        </w:rPr>
+        <w:t xml:space="preserve">          </w:t>
+      </w:r>
+      <w:r>
+        <w:rPr>
+          <w:b/>
+          <w:bCs/>
+        </w:rPr>
+        <w:t>-</w:t>
+      </w:r>
+      <w:r>
+        <w:rPr>
+          <w:b/>
+          <w:bCs/>
+        </w:rPr>
         <w:t xml:space="preserve"> </w:t>
       </w:r>
+      <w:r>
+        <w:rPr>
+          <w:b/>
+          <w:bCs/>
+        </w:rPr>
+        <w:t>Robustesse</w:t>
+      </w:r>
+      <w:r>
+        <w:t> : le jeu doit être ouvert et non interrompue par bugs ou autre, le jeu ne devra pas avoir de soft-lock.</w:t>
+      </w:r>
+    </w:p>
+    <w:p>
+      <w:r>
+        <w:t xml:space="preserve">          - </w:t>
+      </w:r>
+      <w:r>
+        <w:rPr>
+          <w:b/>
+          <w:bCs/>
+        </w:rPr>
+        <w:t>Efficacité</w:t>
+      </w:r>
+      <w:r>
+        <w:t xml:space="preserve"> : </w:t>
+      </w:r>
+      <w:r>
+        <w:t>l</w:t>
+      </w:r>
+      <w:r>
+        <w:t xml:space="preserve">e jeu doit être fluide et garder un nombre de </w:t>
+      </w:r>
+      <w:proofErr w:type="spellStart"/>
+      <w:r>
+        <w:t>fps</w:t>
+      </w:r>
+      <w:proofErr w:type="spellEnd"/>
+      <w:r>
+        <w:t xml:space="preserve"> (60 </w:t>
+      </w:r>
+      <w:proofErr w:type="spellStart"/>
+      <w:r>
+        <w:t>fps</w:t>
+      </w:r>
+      <w:proofErr w:type="spellEnd"/>
+      <w:r>
+        <w:t xml:space="preserve"> sur une machine moyenne) constant pour rendre l’expérience de jeu plus agréable, les assets et le code du jeu devront être </w:t>
+      </w:r>
+      <w:r>
+        <w:t>optimiser afin d’assurer un jeu léger.</w:t>
+      </w:r>
+      <w:r>
+        <w:t xml:space="preserve"> </w:t>
+      </w:r>
+    </w:p>
+    <w:p>
+      <w:r>
+        <w:t xml:space="preserve">          - </w:t>
+      </w:r>
+      <w:r>
+        <w:rPr>
+          <w:b/>
+          <w:bCs/>
+        </w:rPr>
+        <w:t>Portabilité</w:t>
+      </w:r>
+      <w:r>
+        <w:t> : le jeu doit être jouable sur plusieurs machines différentes tant qu’elles sont sous Windows 11 et qu’elles ont une configuration au moins moyenne.</w:t>
+      </w:r>
+    </w:p>
+    <w:p>
+      <w:r>
+        <w:t xml:space="preserve">          - </w:t>
+      </w:r>
+      <w:r>
+        <w:rPr>
+          <w:b/>
+          <w:bCs/>
+        </w:rPr>
+        <w:t>Sécurité</w:t>
+      </w:r>
+      <w:r>
+        <w:t xml:space="preserve"> : le jeu ne publiera ou ne collectera aucunes données personnelles de ces joueurs, le jeu n’utilisera que les données nécessaires à son fonctionnement. Le jeu ne contiendra aucuns logiciels espion, malveillant, capable de compromettre l’efficacité, l’utilisabilité et la sécurité de la machine du joueur. </w:t>
+      </w:r>
+    </w:p>
+    <w:p>
+      <w:pPr>
+        <w:rPr>
+          <w:b/>
+          <w:bCs/>
+        </w:rPr>
+      </w:pPr>
+    </w:p>
+    <w:p>
+      <w:pPr>
+        <w:rPr>
+          <w:b/>
+          <w:bCs/>
+        </w:rPr>
+      </w:pPr>
+      <w:r>
+        <w:rPr>
+          <w:b/>
+          <w:bCs/>
+        </w:rPr>
+        <w:t>4.2.2 Exigences de programmation</w:t>
+      </w:r>
+    </w:p>
+    <w:p>
+      <w:r>
+        <w:t>Langage de programmation </w:t>
+      </w:r>
+      <w:r>
+        <w:rPr>
+          <w:b/>
+          <w:bCs/>
+        </w:rPr>
+        <w:t xml:space="preserve">: </w:t>
+      </w:r>
+      <w:proofErr w:type="spellStart"/>
+      <w:r>
+        <w:rPr>
+          <w:b/>
+          <w:bCs/>
+        </w:rPr>
+        <w:t>GDScript</w:t>
+      </w:r>
+      <w:proofErr w:type="spellEnd"/>
+      <w:r>
+        <w:rPr>
+          <w:b/>
+          <w:bCs/>
+        </w:rPr>
+        <w:t>, C#, C++</w:t>
+      </w:r>
+    </w:p>
+    <w:p>
+      <w:pPr>
+        <w:rPr>
+          <w:b/>
+          <w:bCs/>
+        </w:rPr>
+      </w:pPr>
+      <w:r>
+        <w:t xml:space="preserve">Norme : </w:t>
+      </w:r>
+      <w:r>
+        <w:rPr>
+          <w:b/>
+          <w:bCs/>
+        </w:rPr>
+        <w:t>C++17</w:t>
+      </w:r>
+      <w:r>
+        <w:rPr>
+          <w:b/>
+          <w:bCs/>
+        </w:rPr>
+        <w:t xml:space="preserve"> </w:t>
+      </w:r>
+    </w:p>
+    <w:p>
+      <w:r>
+        <w:t xml:space="preserve">Règle de style : </w:t>
+      </w:r>
+      <w:hyperlink r:id="rId6" w:history="1">
+        <w:r>
+          <w:rPr>
+            <w:rStyle w:val="Lienhypertexte"/>
+          </w:rPr>
+          <w:t>https://docs.godotengine.org/fr/4.x/tutorials/scripting/gdscript/gdscript_styleguide.html</w:t>
+        </w:r>
+      </w:hyperlink>
+    </w:p>
+    <w:p>
+      <w:pPr>
+        <w:rPr>
+          <w:b/>
+          <w:bCs/>
+        </w:rPr>
+      </w:pPr>
+      <w:r>
+        <w:lastRenderedPageBreak/>
+        <w:t xml:space="preserve">Traitement des erreurs : </w:t>
+      </w:r>
+      <w:r>
+        <w:rPr>
+          <w:b/>
+          <w:bCs/>
+        </w:rPr>
+        <w:t xml:space="preserve">test effectuer de </w:t>
+      </w:r>
       <w:proofErr w:type="gramStart"/>
       <w:r>
+        <w:rPr>
+          <w:b/>
+          <w:bCs/>
+        </w:rPr>
+        <w:t>toute les fonctionnalité</w:t>
+      </w:r>
+      <w:proofErr w:type="gramEnd"/>
+      <w:r>
+        <w:rPr>
+          <w:b/>
+          <w:bCs/>
+        </w:rPr>
+        <w:t xml:space="preserve"> et </w:t>
+      </w:r>
+      <w:proofErr w:type="gramStart"/>
+      <w:r>
+        <w:rPr>
+          <w:b/>
+          <w:bCs/>
+        </w:rPr>
+        <w:t>des niveau</w:t>
+      </w:r>
+      <w:proofErr w:type="gramEnd"/>
+      <w:r>
+        <w:rPr>
+          <w:b/>
+          <w:bCs/>
+        </w:rPr>
+        <w:t xml:space="preserve"> par nous</w:t>
+      </w:r>
+      <w:r>
+        <w:rPr>
+          <w:b/>
+          <w:bCs/>
+        </w:rPr>
+        <w:t>.</w:t>
+      </w:r>
+    </w:p>
+    <w:p>
+      <w:pPr>
+        <w:rPr>
+          <w:b/>
+          <w:bCs/>
+        </w:rPr>
+      </w:pPr>
+      <w:r>
+        <w:t xml:space="preserve">Taille mémoire : </w:t>
+      </w:r>
+      <w:r>
+        <w:rPr>
+          <w:b/>
+          <w:bCs/>
+        </w:rPr>
+        <w:t xml:space="preserve">moins que </w:t>
+      </w:r>
+      <w:r>
+        <w:rPr>
+          <w:b/>
+          <w:bCs/>
+        </w:rPr>
+        <w:t>2</w:t>
+      </w:r>
+      <w:r>
+        <w:rPr>
+          <w:b/>
+          <w:bCs/>
+        </w:rPr>
+        <w:t xml:space="preserve"> </w:t>
+      </w:r>
+      <w:proofErr w:type="gramStart"/>
+      <w:r>
+        <w:rPr>
+          <w:b/>
+          <w:bCs/>
+        </w:rPr>
+        <w:t>giga.</w:t>
+      </w:r>
+      <w:r>
+        <w:rPr>
+          <w:b/>
+          <w:bCs/>
+        </w:rPr>
         <w:t>(</w:t>
       </w:r>
       <w:proofErr w:type="gramEnd"/>
       <w:r>
-        <w:t>NEED CONDITION)</w:t>
-      </w:r>
-    </w:p>
-    <w:p>
-      <w:r>
-        <w:t xml:space="preserve">         - Crée un tutoriel qui permettra aux joueurs d’appréhendé les contrôles et le gameplay du jeu, ce/ces tutoriels devront expliquer toutes les mécanique et concept du jeu. Aucune garantie que le/les tutoriels couvrent l’entièreté des utilisations possible ou donne les solutions aux énigmes.</w:t>
-      </w:r>
+        <w:rPr>
+          <w:b/>
+          <w:bCs/>
+        </w:rPr>
+        <w:t>PAS SUR)</w:t>
+      </w:r>
+    </w:p>
+    <w:p>
+      <w:pPr>
+        <w:rPr>
+          <w:b/>
+          <w:bCs/>
+        </w:rPr>
+      </w:pPr>
+    </w:p>
+    <w:p>
+      <w:pPr>
+        <w:rPr>
+          <w:b/>
+          <w:bCs/>
+        </w:rPr>
+      </w:pPr>
+      <w:r>
+        <w:rPr>
+          <w:b/>
+          <w:bCs/>
+        </w:rPr>
+        <w:t>4.2.3 Exigences envers les outils de développement</w:t>
+      </w:r>
+    </w:p>
+    <w:p>
+      <w:r>
+        <w:t xml:space="preserve">   -Godot + certain plugin</w:t>
+      </w:r>
+    </w:p>
+    <w:p>
+      <w:r>
+        <w:t xml:space="preserve">   -Vs Code / Vs 2022</w:t>
+      </w:r>
+    </w:p>
+    <w:p/>
+    <w:p>
+      <w:pPr>
+        <w:rPr>
+          <w:b/>
+          <w:bCs/>
+        </w:rPr>
+      </w:pPr>
+      <w:r>
+        <w:rPr>
+          <w:b/>
+          <w:bCs/>
+        </w:rPr>
+        <w:t>4.2.4</w:t>
+      </w:r>
+      <w:r>
+        <w:rPr>
+          <w:b/>
+          <w:bCs/>
+        </w:rPr>
+        <w:t xml:space="preserve"> Exigences particulières de sécurité </w:t>
+      </w:r>
+    </w:p>
+    <w:p>
+      <w:r>
+        <w:t xml:space="preserve">    - </w:t>
+      </w:r>
+      <w:r>
+        <w:rPr>
+          <w:b/>
+          <w:bCs/>
+        </w:rPr>
+        <w:t xml:space="preserve">Confidentialité : </w:t>
+      </w:r>
+      <w:r>
+        <w:t>le jeu ne publiera ou ne collectera aucunes données personnelles de ces joueurs, le jeu n’utilisera que les données nécessaires à son fonctionnement.</w:t>
+      </w:r>
+    </w:p>
+    <w:p>
+      <w:r>
+        <w:t xml:space="preserve">    - </w:t>
+      </w:r>
+      <w:r>
+        <w:rPr>
+          <w:b/>
+          <w:bCs/>
+        </w:rPr>
+        <w:t xml:space="preserve">Intégrité : </w:t>
+      </w:r>
+      <w:r>
+        <w:t xml:space="preserve">Le jeu ne contiendra aucuns logiciels espion, malveillant, capable de compromettre l’efficacité, l’utilisabilité et la sécurité de la machine du joueur. </w:t>
+      </w:r>
+    </w:p>
+    <w:p>
+      <w:r>
+        <w:t xml:space="preserve">- La confidentialité et sécurité du jeu ne sera assurer qui si la copie du jeu est authentique </w:t>
+      </w:r>
+    </w:p>
+    <w:p/>
+    <w:p>
+      <w:pPr>
+        <w:rPr>
+          <w:b/>
+          <w:bCs/>
+        </w:rPr>
+      </w:pPr>
+      <w:r>
+        <w:rPr>
+          <w:b/>
+          <w:bCs/>
+        </w:rPr>
+        <w:t xml:space="preserve">4.3 Exigences opérationnelles </w:t>
+      </w:r>
+    </w:p>
+    <w:p>
+      <w:pPr>
+        <w:rPr>
+          <w:b/>
+          <w:bCs/>
+        </w:rPr>
+      </w:pPr>
+      <w:r>
+        <w:rPr>
+          <w:b/>
+          <w:bCs/>
+        </w:rPr>
+        <w:t>4.3.1 Environnement</w:t>
+      </w:r>
+    </w:p>
+    <w:p>
+      <w:pPr>
+        <w:rPr>
+          <w:b/>
+          <w:bCs/>
+        </w:rPr>
+      </w:pPr>
+      <w:r>
+        <w:rPr>
+          <w:b/>
+          <w:bCs/>
+        </w:rPr>
+        <w:t>4.3.1.1 Environnement matériel</w:t>
+      </w:r>
+    </w:p>
+    <w:p>
+      <w:r>
+        <w:t xml:space="preserve">   -Ordinateurs sous </w:t>
+      </w:r>
+      <w:proofErr w:type="spellStart"/>
+      <w:r>
+        <w:t>windows</w:t>
+      </w:r>
+      <w:proofErr w:type="spellEnd"/>
+      <w:r>
+        <w:t xml:space="preserve"> 11 avec une configurations moyenne disposant d’une carte graphique, d’un processeur, une carte mère, de RAM, d’un disque dur, d</w:t>
+      </w:r>
+      <w:r>
+        <w:t>’une alimentation et d’un contrôleur.</w:t>
+      </w:r>
+    </w:p>
+    <w:p>
+      <w:pPr>
+        <w:rPr>
+          <w:b/>
+          <w:bCs/>
+        </w:rPr>
+      </w:pPr>
+    </w:p>
+    <w:p>
+      <w:pPr>
+        <w:rPr>
+          <w:b/>
+          <w:bCs/>
+        </w:rPr>
+      </w:pPr>
+      <w:r>
+        <w:rPr>
+          <w:b/>
+          <w:bCs/>
+        </w:rPr>
+        <w:t>4.3.1.2 Environnement logiciel</w:t>
+      </w:r>
+    </w:p>
+    <w:p/>
+    <w:p>
+      <w:pPr>
+        <w:rPr>
+          <w:b/>
+          <w:bCs/>
+        </w:rPr>
+      </w:pPr>
     </w:p>
     <w:p>
       <w:r>
@@ -1383,7 +1992,6 @@
   <w:style w:type="character" w:default="1" w:styleId="Policepardfaut">
     <w:name w:val="Default Paragraph Font"/>
     <w:uiPriority w:val="1"/>
-    <w:semiHidden/>
     <w:unhideWhenUsed/>
   </w:style>
   <w:style w:type="table" w:default="1" w:styleId="TableauNormal">

</xml_diff>